<commit_message>
eddited time zone and headline
</commit_message>
<xml_diff>
--- a/public/downloads/03-guide-apps-script-setup-en.docx
+++ b/public/downloads/03-guide-apps-script-setup-en.docx
@@ -658,7 +658,7 @@
           <w:sz w:val="20"/>
           <w:szCs w:val="20"/>
         </w:rPr>
-        <w:t xml:space="preserve">Choose Belgrade, that is (GMT+01:00) Central European Time.</w:t>
+        <w:t xml:space="preserve">Choose the time zone where your salon is located.</w:t>
       </w:r>
     </w:p>
     <w:p>
@@ -1832,7 +1832,7 @@
                 <w:sz w:val="19"/>
                 <w:szCs w:val="19"/>
               </w:rPr>
-              <w:t xml:space="preserve">The project's time zone isn't Belgrade. Go back to step three.</w:t>
+              <w:t xml:space="preserve">The project's time zone doesn't match your salon’s local time zone. Go back to step three.</w:t>
             </w:r>
           </w:p>
         </w:tc>

</xml_diff>